<commit_message>
Assignment 3 now uses pretrained word2vec
</commit_message>
<xml_diff>
--- a/Assignment3/results/340915149_206216517.docx
+++ b/Assignment3/results/340915149_206216517.docx
@@ -221,7 +221,6 @@
         </w:numPr>
         <w:rPr>
           <w:noProof/>
-          <w:lang w:val="ru-RU"/>
         </w:rPr>
       </w:pPr>
       <w:r>
@@ -744,24 +743,16 @@
     <w:p>
       <w:pPr>
         <w:rPr>
-          <w:b/>
-          <w:bCs/>
-          <w:noProof/>
-        </w:rPr>
-      </w:pPr>
-    </w:p>
-    <w:p>
-      <w:pPr>
-        <w:rPr>
-          <w:noProof/>
-        </w:rPr>
-      </w:pPr>
-      <w:r>
-        <w:rPr>
-          <w:b/>
-          <w:bCs/>
-          <w:noProof/>
-        </w:rPr>
+          <w:noProof/>
+        </w:rPr>
+      </w:pPr>
+      <w:r>
+        <w:rPr>
+          <w:b/>
+          <w:bCs/>
+          <w:noProof/>
+        </w:rPr>
+        <w:lastRenderedPageBreak/>
         <w:t xml:space="preserve">1.4. </w:t>
       </w:r>
       <w:r>
@@ -790,7 +781,33 @@
         <w:rPr>
           <w:noProof/>
         </w:rPr>
-        <w:t>To represent words as dense vectors, a Word2Vec model was trained on the tokenized training lyrics:</w:t>
+        <w:t xml:space="preserve">To represent words as dense vectors, </w:t>
+      </w:r>
+      <w:r>
+        <w:rPr>
+          <w:noProof/>
+        </w:rPr>
+        <w:t>we took pretrained</w:t>
+      </w:r>
+      <w:r>
+        <w:rPr>
+          <w:noProof/>
+        </w:rPr>
+        <w:t xml:space="preserve"> Word2Vec model</w:t>
+      </w:r>
+      <w:r>
+        <w:rPr>
+          <w:i/>
+          <w:iCs/>
+          <w:noProof/>
+        </w:rPr>
+        <w:t>.</w:t>
+      </w:r>
+      <w:r>
+        <w:rPr>
+          <w:noProof/>
+        </w:rPr>
+        <w:t xml:space="preserve"> Eech word that was not presented in pretrained model was initialized randomly. </w:t>
       </w:r>
     </w:p>
     <w:p>
@@ -801,6 +818,8 @@
           <w:numId w:val="37"/>
         </w:numPr>
         <w:rPr>
+          <w:b/>
+          <w:bCs/>
           <w:noProof/>
         </w:rPr>
       </w:pPr>
@@ -816,8 +835,32 @@
         <w:rPr>
           <w:noProof/>
         </w:rPr>
-        <w:t xml:space="preserve"> A Skip-gram Word2Vec model was trained using the gensim library.</w:t>
-      </w:r>
+        <w:t xml:space="preserve"> </w:t>
+      </w:r>
+      <w:r>
+        <w:rPr>
+          <w:i/>
+          <w:iCs/>
+          <w:noProof/>
+        </w:rPr>
+        <w:t>word2vec-google-news-30</w:t>
+      </w:r>
+      <w:r>
+        <w:rPr>
+          <w:b/>
+          <w:bCs/>
+          <w:noProof/>
+        </w:rPr>
+        <w:t>0</w:t>
+      </w:r>
+    </w:p>
+    <w:p>
+      <w:pPr>
+        <w:pStyle w:val="ListParagraph"/>
+        <w:rPr>
+          <w:noProof/>
+        </w:rPr>
+      </w:pPr>
     </w:p>
     <w:p>
       <w:pPr>
@@ -835,9 +878,202 @@
           <w:b/>
           <w:bCs/>
           <w:noProof/>
-          <w:lang w:val="ru-RU"/>
-        </w:rPr>
-        <w:t>Parameters:</w:t>
+        </w:rPr>
+        <w:t>Embedding Matrix:</w:t>
+      </w:r>
+      <w:r>
+        <w:rPr>
+          <w:noProof/>
+        </w:rPr>
+        <w:t xml:space="preserve"> An embedding matrix of shape (vocab_size, embedding_dim) was created. For words present</w:t>
+      </w:r>
+      <w:r>
+        <w:rPr>
+          <w:noProof/>
+        </w:rPr>
+        <w:t>ed</w:t>
+      </w:r>
+      <w:r>
+        <w:rPr>
+          <w:noProof/>
+        </w:rPr>
+        <w:t xml:space="preserve"> in </w:t>
+      </w:r>
+      <w:r>
+        <w:rPr>
+          <w:noProof/>
+        </w:rPr>
+        <w:t>pretrained</w:t>
+      </w:r>
+      <w:r>
+        <w:rPr>
+          <w:noProof/>
+        </w:rPr>
+        <w:t xml:space="preserve"> Word2Vec model's vocabulary</w:t>
+      </w:r>
+      <w:r>
+        <w:rPr>
+          <w:noProof/>
+        </w:rPr>
+        <w:t xml:space="preserve"> (</w:t>
+      </w:r>
+      <w:r>
+        <w:rPr>
+          <w:b/>
+          <w:bCs/>
+          <w:noProof/>
+        </w:rPr>
+        <w:t>6714</w:t>
+      </w:r>
+      <w:r>
+        <w:rPr>
+          <w:noProof/>
+        </w:rPr>
+        <w:t xml:space="preserve"> words)</w:t>
+      </w:r>
+      <w:r>
+        <w:rPr>
+          <w:noProof/>
+        </w:rPr>
+        <w:t>, their respective vectors were used. The special tokens (&lt;NEXT LINE&gt;, &lt;START&gt;, &lt;END&gt;)</w:t>
+      </w:r>
+      <w:r>
+        <w:rPr>
+          <w:noProof/>
+        </w:rPr>
+        <w:t xml:space="preserve"> and words which were not presentend in model's vocabulary</w:t>
+      </w:r>
+      <w:r>
+        <w:rPr>
+          <w:noProof/>
+        </w:rPr>
+        <w:t xml:space="preserve"> (</w:t>
+      </w:r>
+      <w:r>
+        <w:rPr>
+          <w:b/>
+          <w:bCs/>
+          <w:noProof/>
+        </w:rPr>
+        <w:t>671</w:t>
+      </w:r>
+      <w:r>
+        <w:rPr>
+          <w:noProof/>
+        </w:rPr>
+        <w:t xml:space="preserve"> words)</w:t>
+      </w:r>
+      <w:r>
+        <w:rPr>
+          <w:noProof/>
+        </w:rPr>
+        <w:t xml:space="preserve"> were initialized with random vectors drawn from a uniform distribution U(-0.25, 0.25). The &lt;PAD&gt; token's vector remained zeros. This matrix was used to initialize the </w:t>
+      </w:r>
+      <w:r>
+        <w:rPr>
+          <w:noProof/>
+          <w:u w:val="single"/>
+        </w:rPr>
+        <w:t>embedding layer</w:t>
+      </w:r>
+      <w:r>
+        <w:rPr>
+          <w:noProof/>
+        </w:rPr>
+        <w:t xml:space="preserve"> in our neural network models.</w:t>
+      </w:r>
+    </w:p>
+    <w:p>
+      <w:pPr>
+        <w:ind w:left="360"/>
+        <w:rPr>
+          <w:b/>
+          <w:bCs/>
+          <w:noProof/>
+        </w:rPr>
+      </w:pPr>
+    </w:p>
+    <w:p>
+      <w:pPr>
+        <w:rPr>
+          <w:b/>
+          <w:bCs/>
+          <w:noProof/>
+          <w:u w:val="single"/>
+        </w:rPr>
+      </w:pPr>
+      <w:r>
+        <w:rPr>
+          <w:b/>
+          <w:bCs/>
+          <w:noProof/>
+          <w:u w:val="single"/>
+        </w:rPr>
+        <w:t>2. Approach 1: Simple Model - Global Melody Features</w:t>
+      </w:r>
+    </w:p>
+    <w:p>
+      <w:pPr>
+        <w:rPr>
+          <w:noProof/>
+        </w:rPr>
+      </w:pPr>
+      <w:r>
+        <w:rPr>
+          <w:noProof/>
+        </w:rPr>
+        <w:t>The first approach involved a model that considers global features of the melody, providing a general musical context for lyrics generation.</w:t>
+      </w:r>
+    </w:p>
+    <w:p>
+      <w:pPr>
+        <w:rPr>
+          <w:b/>
+          <w:bCs/>
+          <w:noProof/>
+        </w:rPr>
+      </w:pPr>
+      <w:r>
+        <w:rPr>
+          <w:b/>
+          <w:bCs/>
+          <w:noProof/>
+        </w:rPr>
+        <w:t>2.1. Dataset for Simple Model</w:t>
+      </w:r>
+      <w:r>
+        <w:rPr>
+          <w:b/>
+          <w:bCs/>
+          <w:noProof/>
+        </w:rPr>
+        <w:t xml:space="preserve"> </w:t>
+      </w:r>
+    </w:p>
+    <w:p>
+      <w:pPr>
+        <w:pStyle w:val="ListParagraph"/>
+        <w:numPr>
+          <w:ilvl w:val="0"/>
+          <w:numId w:val="40"/>
+        </w:numPr>
+        <w:rPr>
+          <w:b/>
+          <w:bCs/>
+          <w:noProof/>
+        </w:rPr>
+      </w:pPr>
+      <w:r>
+        <w:rPr>
+          <w:noProof/>
+        </w:rPr>
+        <w:t>For this model, a fixed set of global features was extracted from each MIDI file</w:t>
+      </w:r>
+      <w:r>
+        <w:rPr>
+          <w:noProof/>
+        </w:rPr>
+        <w:t>:</w:t>
       </w:r>
     </w:p>
     <w:p>
@@ -853,10 +1089,17 @@
       </w:pPr>
       <w:r>
         <w:rPr>
-          <w:noProof/>
-          <w:lang w:val="ru-RU"/>
-        </w:rPr>
-        <w:t>vector_size: 300 (embedding dimension)</w:t>
+          <w:b/>
+          <w:bCs/>
+          <w:noProof/>
+        </w:rPr>
+        <w:t>Tempo:</w:t>
+      </w:r>
+      <w:r>
+        <w:rPr>
+          <w:noProof/>
+        </w:rPr>
+        <w:t xml:space="preserve"> Mean tempo of the song (derived from tempo changes). </w:t>
       </w:r>
     </w:p>
     <w:p>
@@ -872,10 +1115,17 @@
       </w:pPr>
       <w:r>
         <w:rPr>
-          <w:noProof/>
-          <w:lang w:val="ru-RU"/>
-        </w:rPr>
-        <w:t>window: 5 (context window size)</w:t>
+          <w:b/>
+          <w:bCs/>
+          <w:noProof/>
+        </w:rPr>
+        <w:t>Average Pitch:</w:t>
+      </w:r>
+      <w:r>
+        <w:rPr>
+          <w:noProof/>
+        </w:rPr>
+        <w:t xml:space="preserve"> Mean pitch of all notes in the song. </w:t>
       </w:r>
     </w:p>
     <w:p>
@@ -891,11 +1141,131 @@
       </w:pPr>
       <w:r>
         <w:rPr>
-          <w:noProof/>
-          <w:lang w:val="ru-RU"/>
-        </w:rPr>
-        <w:t>epochs: 20</w:t>
-      </w:r>
+          <w:b/>
+          <w:bCs/>
+          <w:noProof/>
+        </w:rPr>
+        <w:t>Pitch Standard Deviation:</w:t>
+      </w:r>
+      <w:r>
+        <w:rPr>
+          <w:noProof/>
+        </w:rPr>
+        <w:t xml:space="preserve"> Standard deviation of pitches. </w:t>
+      </w:r>
+    </w:p>
+    <w:p>
+      <w:pPr>
+        <w:pStyle w:val="ListParagraph"/>
+        <w:numPr>
+          <w:ilvl w:val="1"/>
+          <w:numId w:val="37"/>
+        </w:numPr>
+        <w:rPr>
+          <w:noProof/>
+        </w:rPr>
+      </w:pPr>
+      <w:r>
+        <w:rPr>
+          <w:b/>
+          <w:bCs/>
+          <w:noProof/>
+        </w:rPr>
+        <w:t>Pitch Range:</w:t>
+      </w:r>
+      <w:r>
+        <w:rPr>
+          <w:noProof/>
+        </w:rPr>
+        <w:t xml:space="preserve"> Difference between maximum and minimum pitch. </w:t>
+      </w:r>
+    </w:p>
+    <w:p>
+      <w:pPr>
+        <w:pStyle w:val="ListParagraph"/>
+        <w:numPr>
+          <w:ilvl w:val="1"/>
+          <w:numId w:val="37"/>
+        </w:numPr>
+        <w:rPr>
+          <w:noProof/>
+        </w:rPr>
+      </w:pPr>
+      <w:r>
+        <w:rPr>
+          <w:b/>
+          <w:bCs/>
+          <w:noProof/>
+        </w:rPr>
+        <w:t>Average Duration:</w:t>
+      </w:r>
+      <w:r>
+        <w:rPr>
+          <w:noProof/>
+        </w:rPr>
+        <w:t xml:space="preserve"> Mean duration of notes. </w:t>
+      </w:r>
+    </w:p>
+    <w:p>
+      <w:pPr>
+        <w:pStyle w:val="ListParagraph"/>
+        <w:numPr>
+          <w:ilvl w:val="1"/>
+          <w:numId w:val="37"/>
+        </w:numPr>
+        <w:rPr>
+          <w:noProof/>
+        </w:rPr>
+      </w:pPr>
+      <w:r>
+        <w:rPr>
+          <w:b/>
+          <w:bCs/>
+          <w:noProof/>
+        </w:rPr>
+        <w:t>Average Velocity:</w:t>
+      </w:r>
+      <w:r>
+        <w:rPr>
+          <w:noProof/>
+        </w:rPr>
+        <w:t xml:space="preserve"> Mean velocity (loudness) of notes. </w:t>
+      </w:r>
+    </w:p>
+    <w:p>
+      <w:pPr>
+        <w:pStyle w:val="ListParagraph"/>
+        <w:numPr>
+          <w:ilvl w:val="1"/>
+          <w:numId w:val="37"/>
+        </w:numPr>
+        <w:rPr>
+          <w:noProof/>
+        </w:rPr>
+      </w:pPr>
+      <w:r>
+        <w:rPr>
+          <w:b/>
+          <w:bCs/>
+          <w:noProof/>
+        </w:rPr>
+        <w:t>Note Density:</w:t>
+      </w:r>
+      <w:r>
+        <w:rPr>
+          <w:noProof/>
+        </w:rPr>
+        <w:t xml:space="preserve"> Total number of notes divided by the song's total duration. </w:t>
+      </w:r>
+    </w:p>
+    <w:p>
+      <w:pPr>
+        <w:pStyle w:val="ListParagraph"/>
+        <w:ind w:left="1440"/>
+        <w:rPr>
+          <w:noProof/>
+        </w:rPr>
+      </w:pPr>
     </w:p>
     <w:p>
       <w:pPr>
@@ -914,307 +1284,18 @@
           <w:bCs/>
           <w:noProof/>
         </w:rPr>
-        <w:t>Embedding Matrix:</w:t>
-      </w:r>
-      <w:r>
-        <w:rPr>
-          <w:noProof/>
-        </w:rPr>
-        <w:t xml:space="preserve"> An embedding matrix of shape (vocab_size, embedding_dim) was created. For words present in the Word2Vec model's vocabulary, their respective vectors were used. The special tokens (&lt;NEXT LINE&gt;, &lt;START&gt;, &lt;END&gt;) were initialized with random vectors drawn from a uniform distribution U(-0.25, 0.25). The &lt;PAD&gt; token's vector remained zeros. This matrix was used to initialize the </w:t>
-      </w:r>
-      <w:r>
-        <w:rPr>
-          <w:noProof/>
-          <w:u w:val="single"/>
-        </w:rPr>
-        <w:t>embedding layer</w:t>
-      </w:r>
-      <w:r>
-        <w:rPr>
-          <w:noProof/>
-        </w:rPr>
-        <w:t xml:space="preserve"> in our neural network models.</w:t>
-      </w:r>
-    </w:p>
-    <w:p>
-      <w:pPr>
-        <w:ind w:left="360"/>
-        <w:rPr>
-          <w:b/>
-          <w:bCs/>
-          <w:noProof/>
-        </w:rPr>
-      </w:pPr>
-    </w:p>
-    <w:p>
-      <w:pPr>
-        <w:rPr>
-          <w:b/>
-          <w:bCs/>
-          <w:noProof/>
-          <w:u w:val="single"/>
-        </w:rPr>
-      </w:pPr>
-      <w:r>
-        <w:rPr>
-          <w:b/>
-          <w:bCs/>
-          <w:noProof/>
-          <w:u w:val="single"/>
-        </w:rPr>
-        <w:t>2. Approach 1: Simple Model - Global Melody Features</w:t>
-      </w:r>
-    </w:p>
-    <w:p>
-      <w:pPr>
-        <w:rPr>
-          <w:noProof/>
-        </w:rPr>
-      </w:pPr>
-      <w:r>
-        <w:rPr>
-          <w:noProof/>
-        </w:rPr>
-        <w:t>The first approach involved a model that considers global features of the melody, providing a general musical context for lyrics generation.</w:t>
-      </w:r>
-    </w:p>
-    <w:p>
-      <w:pPr>
-        <w:rPr>
-          <w:b/>
-          <w:bCs/>
-          <w:noProof/>
-        </w:rPr>
-      </w:pPr>
-      <w:r>
-        <w:rPr>
-          <w:b/>
-          <w:bCs/>
-          <w:noProof/>
-        </w:rPr>
-        <w:t>2.1. Dataset for Simple Model</w:t>
-      </w:r>
-      <w:r>
-        <w:rPr>
-          <w:b/>
-          <w:bCs/>
-          <w:noProof/>
-        </w:rPr>
-        <w:t xml:space="preserve"> </w:t>
+        <w:t>Sequence Preparation:</w:t>
+      </w:r>
+      <w:r>
+        <w:rPr>
+          <w:noProof/>
+        </w:rPr>
+        <w:t xml:space="preserve"> For each song, lyrics were tokenized, and special tokens (&lt;START&gt;, &lt;NEXT LINE&gt;, &lt;END&gt;) were added. &lt;START&gt; was prepended, &lt;NEXT LINE&gt; was appended after each actual line, and the final &lt;NEXT LINE&gt; was replaced by &lt;END&gt;.</w:t>
       </w:r>
     </w:p>
     <w:p>
       <w:pPr>
         <w:pStyle w:val="ListParagraph"/>
-        <w:numPr>
-          <w:ilvl w:val="0"/>
-          <w:numId w:val="40"/>
-        </w:numPr>
-        <w:rPr>
-          <w:b/>
-          <w:bCs/>
-          <w:noProof/>
-        </w:rPr>
-      </w:pPr>
-      <w:r>
-        <w:rPr>
-          <w:noProof/>
-        </w:rPr>
-        <w:t>For this model, a fixed set of global features was extracted from each MIDI file</w:t>
-      </w:r>
-      <w:r>
-        <w:rPr>
-          <w:noProof/>
-        </w:rPr>
-        <w:t>:</w:t>
-      </w:r>
-    </w:p>
-    <w:p>
-      <w:pPr>
-        <w:pStyle w:val="ListParagraph"/>
-        <w:numPr>
-          <w:ilvl w:val="1"/>
-          <w:numId w:val="37"/>
-        </w:numPr>
-        <w:rPr>
-          <w:noProof/>
-        </w:rPr>
-      </w:pPr>
-      <w:r>
-        <w:rPr>
-          <w:b/>
-          <w:bCs/>
-          <w:noProof/>
-        </w:rPr>
-        <w:t>Tempo:</w:t>
-      </w:r>
-      <w:r>
-        <w:rPr>
-          <w:noProof/>
-        </w:rPr>
-        <w:t xml:space="preserve"> Mean tempo of the song (derived from tempo changes). </w:t>
-      </w:r>
-    </w:p>
-    <w:p>
-      <w:pPr>
-        <w:pStyle w:val="ListParagraph"/>
-        <w:numPr>
-          <w:ilvl w:val="1"/>
-          <w:numId w:val="37"/>
-        </w:numPr>
-        <w:rPr>
-          <w:noProof/>
-        </w:rPr>
-      </w:pPr>
-      <w:r>
-        <w:rPr>
-          <w:b/>
-          <w:bCs/>
-          <w:noProof/>
-        </w:rPr>
-        <w:t>Average Pitch:</w:t>
-      </w:r>
-      <w:r>
-        <w:rPr>
-          <w:noProof/>
-        </w:rPr>
-        <w:t xml:space="preserve"> Mean pitch of all notes in the song. </w:t>
-      </w:r>
-    </w:p>
-    <w:p>
-      <w:pPr>
-        <w:pStyle w:val="ListParagraph"/>
-        <w:numPr>
-          <w:ilvl w:val="1"/>
-          <w:numId w:val="37"/>
-        </w:numPr>
-        <w:rPr>
-          <w:noProof/>
-        </w:rPr>
-      </w:pPr>
-      <w:r>
-        <w:rPr>
-          <w:b/>
-          <w:bCs/>
-          <w:noProof/>
-        </w:rPr>
-        <w:t>Pitch Standard Deviation:</w:t>
-      </w:r>
-      <w:r>
-        <w:rPr>
-          <w:noProof/>
-        </w:rPr>
-        <w:t xml:space="preserve"> Standard deviation of pitches. </w:t>
-      </w:r>
-    </w:p>
-    <w:p>
-      <w:pPr>
-        <w:pStyle w:val="ListParagraph"/>
-        <w:numPr>
-          <w:ilvl w:val="1"/>
-          <w:numId w:val="37"/>
-        </w:numPr>
-        <w:rPr>
-          <w:noProof/>
-        </w:rPr>
-      </w:pPr>
-      <w:r>
-        <w:rPr>
-          <w:b/>
-          <w:bCs/>
-          <w:noProof/>
-        </w:rPr>
-        <w:t>Pitch Range:</w:t>
-      </w:r>
-      <w:r>
-        <w:rPr>
-          <w:noProof/>
-        </w:rPr>
-        <w:t xml:space="preserve"> Difference between maximum and minimum pitch. </w:t>
-      </w:r>
-    </w:p>
-    <w:p>
-      <w:pPr>
-        <w:pStyle w:val="ListParagraph"/>
-        <w:numPr>
-          <w:ilvl w:val="1"/>
-          <w:numId w:val="37"/>
-        </w:numPr>
-        <w:rPr>
-          <w:noProof/>
-        </w:rPr>
-      </w:pPr>
-      <w:r>
-        <w:rPr>
-          <w:b/>
-          <w:bCs/>
-          <w:noProof/>
-        </w:rPr>
-        <w:t>Average Duration:</w:t>
-      </w:r>
-      <w:r>
-        <w:rPr>
-          <w:noProof/>
-        </w:rPr>
-        <w:t xml:space="preserve"> Mean duration of notes. </w:t>
-      </w:r>
-    </w:p>
-    <w:p>
-      <w:pPr>
-        <w:pStyle w:val="ListParagraph"/>
-        <w:numPr>
-          <w:ilvl w:val="1"/>
-          <w:numId w:val="37"/>
-        </w:numPr>
-        <w:rPr>
-          <w:noProof/>
-        </w:rPr>
-      </w:pPr>
-      <w:r>
-        <w:rPr>
-          <w:b/>
-          <w:bCs/>
-          <w:noProof/>
-        </w:rPr>
-        <w:t>Average Velocity:</w:t>
-      </w:r>
-      <w:r>
-        <w:rPr>
-          <w:noProof/>
-        </w:rPr>
-        <w:t xml:space="preserve"> Mean velocity (loudness) of notes. </w:t>
-      </w:r>
-    </w:p>
-    <w:p>
-      <w:pPr>
-        <w:pStyle w:val="ListParagraph"/>
-        <w:numPr>
-          <w:ilvl w:val="1"/>
-          <w:numId w:val="37"/>
-        </w:numPr>
-        <w:rPr>
-          <w:noProof/>
-        </w:rPr>
-      </w:pPr>
-      <w:r>
-        <w:rPr>
-          <w:b/>
-          <w:bCs/>
-          <w:noProof/>
-        </w:rPr>
-        <w:t>Note Density:</w:t>
-      </w:r>
-      <w:r>
-        <w:rPr>
-          <w:noProof/>
-        </w:rPr>
-        <w:t xml:space="preserve"> Total number of notes divided by the song's total duration. </w:t>
-      </w:r>
-    </w:p>
-    <w:p>
-      <w:pPr>
-        <w:pStyle w:val="ListParagraph"/>
-        <w:ind w:left="1440"/>
         <w:rPr>
           <w:noProof/>
         </w:rPr>
@@ -1237,40 +1318,6 @@
           <w:bCs/>
           <w:noProof/>
         </w:rPr>
-        <w:t>Sequence Preparation:</w:t>
-      </w:r>
-      <w:r>
-        <w:rPr>
-          <w:noProof/>
-        </w:rPr>
-        <w:t xml:space="preserve"> For each song, lyrics were tokenized, and special tokens (&lt;START&gt;, &lt;NEXT LINE&gt;, &lt;END&gt;) were added. &lt;START&gt; was prepended, &lt;NEXT LINE&gt; was appended after each actual line, and the final &lt;NEXT LINE&gt; was replaced by &lt;END&gt;.</w:t>
-      </w:r>
-    </w:p>
-    <w:p>
-      <w:pPr>
-        <w:pStyle w:val="ListParagraph"/>
-        <w:rPr>
-          <w:noProof/>
-        </w:rPr>
-      </w:pPr>
-    </w:p>
-    <w:p>
-      <w:pPr>
-        <w:pStyle w:val="ListParagraph"/>
-        <w:numPr>
-          <w:ilvl w:val="0"/>
-          <w:numId w:val="37"/>
-        </w:numPr>
-        <w:rPr>
-          <w:noProof/>
-        </w:rPr>
-      </w:pPr>
-      <w:r>
-        <w:rPr>
-          <w:b/>
-          <w:bCs/>
-          <w:noProof/>
-        </w:rPr>
         <w:t>Input-Target Pairs:</w:t>
       </w:r>
       <w:r>
@@ -1371,12 +1418,22 @@
           <w:noProof/>
         </w:rPr>
       </w:pPr>
-      <w:r>
-        <w:rPr>
-          <w:b/>
-          <w:bCs/>
-          <w:noProof/>
-        </w:rPr>
+    </w:p>
+    <w:p>
+      <w:pPr>
+        <w:rPr>
+          <w:b/>
+          <w:bCs/>
+          <w:noProof/>
+        </w:rPr>
+      </w:pPr>
+      <w:r>
+        <w:rPr>
+          <w:b/>
+          <w:bCs/>
+          <w:noProof/>
+        </w:rPr>
+        <w:lastRenderedPageBreak/>
         <w:t xml:space="preserve">2.2. </w:t>
       </w:r>
       <w:r>
@@ -1950,6 +2007,7 @@
         <w:rPr>
           <w:noProof/>
         </w:rPr>
+        <w:lastRenderedPageBreak/>
         <w:drawing>
           <wp:anchor distT="0" distB="0" distL="114300" distR="114300" simplePos="0" relativeHeight="251659264" behindDoc="0" locked="0" layoutInCell="1" allowOverlap="1" wp14:anchorId="48249D82" wp14:editId="74ACF66F">
             <wp:simplePos x="0" y="0"/>
@@ -2337,7 +2395,21 @@
         <w:rPr>
           <w:rFonts w:cstheme="majorBidi"/>
         </w:rPr>
-        <w:t xml:space="preserve"> The next word is chosen by sampling from this distribution using torch.multinomial. A temperature parameter (set to 0.9 for testing) was used to scale the logits before applying the softmax and sampling.</w:t>
+        <w:t xml:space="preserve"> The next word is chosen by sampling from this distribution using </w:t>
+      </w:r>
+      <w:proofErr w:type="gramStart"/>
+      <w:r>
+        <w:rPr>
+          <w:rFonts w:cstheme="majorBidi"/>
+        </w:rPr>
+        <w:t>torch.multinomial</w:t>
+      </w:r>
+      <w:proofErr w:type="gramEnd"/>
+      <w:r>
+        <w:rPr>
+          <w:rFonts w:cstheme="majorBidi"/>
+        </w:rPr>
+        <w:t>. A temperature parameter (set to 0.9 for testing) was used to scale the logits before applying the softmax and sampling.</w:t>
       </w:r>
     </w:p>
     <w:p>
@@ -2499,6 +2571,7 @@
         </w:rPr>
         <w:t xml:space="preserve">(\n). Consecutive newlines </w:t>
       </w:r>
+      <w:proofErr w:type="gramStart"/>
       <w:r>
         <w:rPr>
           <w:rFonts w:cstheme="majorBidi"/>
@@ -2511,6 +2584,7 @@
         </w:rPr>
         <w:t>collapsed</w:t>
       </w:r>
+      <w:proofErr w:type="gramEnd"/>
       <w:r>
         <w:rPr>
           <w:rFonts w:cstheme="majorBidi"/>
@@ -2550,41 +2624,29 @@
           <w:bCs/>
           <w:noProof/>
         </w:rPr>
+        <w:t>Examples of generated lyrics</w:t>
+      </w:r>
+      <w:r>
+        <w:rPr>
+          <w:b/>
+          <w:bCs/>
+          <w:noProof/>
+        </w:rPr>
+        <w:t>:</w:t>
+      </w:r>
+    </w:p>
+    <w:p>
+      <w:pPr>
+        <w:rPr>
+          <w:noProof/>
+        </w:rPr>
+      </w:pPr>
+      <w:r>
+        <w:rPr>
+          <w:noProof/>
+        </w:rPr>
         <w:lastRenderedPageBreak/>
-        <w:t>Examples of generated lyrics</w:t>
-      </w:r>
-      <w:r>
-        <w:rPr>
-          <w:b/>
-          <w:bCs/>
-          <w:noProof/>
-        </w:rPr>
-        <w:t>:</w:t>
-      </w:r>
-    </w:p>
-    <w:p>
-      <w:pPr>
-        <w:rPr>
-          <w:noProof/>
-        </w:rPr>
-      </w:pPr>
-      <w:r>
-        <w:rPr>
-          <w:noProof/>
-        </w:rPr>
-        <w:t>Song: the_bangles - eternal_flame</w:t>
-      </w:r>
-      <w:r>
-        <w:rPr>
-          <w:noProof/>
-        </w:rPr>
-        <w:t>. Starting word:</w:t>
-      </w:r>
-      <w:r>
-        <w:rPr>
-          <w:noProof/>
-        </w:rPr>
-        <w:t xml:space="preserve"> '&lt;START&gt;'</w:t>
+        <w:t>Song: the_bangles - eternal_flame. Starting word: '&lt;START&gt;'</w:t>
       </w:r>
     </w:p>
     <w:p>
@@ -3028,13 +3090,7 @@
         <w:rPr>
           <w:noProof/>
         </w:rPr>
-        <w:t xml:space="preserve"> </w:t>
-      </w:r>
-      <w:r>
-        <w:rPr>
-          <w:noProof/>
-        </w:rPr>
-        <w:t>It happens possible because these words are presented more often in the dataset</w:t>
+        <w:t xml:space="preserve"> It happens possible because these words are presented more often in the dataset</w:t>
       </w:r>
       <w:r>
         <w:rPr>
@@ -3093,38 +3149,38 @@
           <w:noProof/>
           <w:u w:val="single"/>
         </w:rPr>
+        <w:t>3</w:t>
+      </w:r>
+      <w:r>
+        <w:rPr>
+          <w:b/>
+          <w:bCs/>
+          <w:noProof/>
+          <w:u w:val="single"/>
+        </w:rPr>
+        <w:t xml:space="preserve">. </w:t>
+      </w:r>
+      <w:r>
+        <w:rPr>
+          <w:b/>
+          <w:bCs/>
+          <w:noProof/>
+          <w:u w:val="single"/>
+        </w:rPr>
+        <w:t>Approach 2: Advanced Model - Time-Aware Melody Features</w:t>
+      </w:r>
+    </w:p>
+    <w:p>
+      <w:pPr>
+        <w:rPr>
+          <w:noProof/>
+        </w:rPr>
+      </w:pPr>
+      <w:r>
+        <w:rPr>
+          <w:noProof/>
+        </w:rPr>
         <w:lastRenderedPageBreak/>
-        <w:t>3</w:t>
-      </w:r>
-      <w:r>
-        <w:rPr>
-          <w:b/>
-          <w:bCs/>
-          <w:noProof/>
-          <w:u w:val="single"/>
-        </w:rPr>
-        <w:t xml:space="preserve">. </w:t>
-      </w:r>
-      <w:r>
-        <w:rPr>
-          <w:b/>
-          <w:bCs/>
-          <w:noProof/>
-          <w:u w:val="single"/>
-        </w:rPr>
-        <w:t>Approach 2: Advanced Model - Time-Aware Melody Features</w:t>
-      </w:r>
-    </w:p>
-    <w:p>
-      <w:pPr>
-        <w:rPr>
-          <w:noProof/>
-        </w:rPr>
-      </w:pPr>
-      <w:r>
-        <w:rPr>
-          <w:noProof/>
-        </w:rPr>
         <w:t>The second approach aimed to integrate melody information more dynamically by considering musical features that are temporally aligned with the words being generated.</w:t>
       </w:r>
     </w:p>
@@ -3835,24 +3891,24 @@
           <w:bCs/>
           <w:noProof/>
         </w:rPr>
+        <w:t>Advanced Model Architecture</w:t>
+      </w:r>
+    </w:p>
+    <w:p>
+      <w:pPr>
+        <w:rPr>
+          <w:b/>
+          <w:bCs/>
+          <w:noProof/>
+        </w:rPr>
+      </w:pPr>
+      <w:r>
+        <w:rPr>
+          <w:b/>
+          <w:bCs/>
+          <w:noProof/>
+        </w:rPr>
         <w:lastRenderedPageBreak/>
-        <w:t>Advanced Model Architecture</w:t>
-      </w:r>
-    </w:p>
-    <w:p>
-      <w:pPr>
-        <w:rPr>
-          <w:b/>
-          <w:bCs/>
-          <w:noProof/>
-        </w:rPr>
-      </w:pPr>
-      <w:r>
-        <w:rPr>
-          <w:b/>
-          <w:bCs/>
-          <w:noProof/>
-        </w:rPr>
         <w:t>This model uses an LSTM with attention and incorporates time-specific musical features for both context and target words.</w:t>
       </w:r>
     </w:p>
@@ -4257,7 +4313,6 @@
           <w:bCs/>
           <w:noProof/>
         </w:rPr>
-        <w:lastRenderedPageBreak/>
         <w:t>Advanced Model Training</w:t>
       </w:r>
     </w:p>
@@ -4283,6 +4338,7 @@
           <w:lang w:val="ru-RU" w:eastAsia="ja-JP"/>
           <w14:ligatures w14:val="none"/>
         </w:rPr>
+        <w:lastRenderedPageBreak/>
         <w:t>Loss Function:</w:t>
       </w:r>
       <w:r>
@@ -4347,6 +4403,7 @@
         <w:t xml:space="preserve"> </w:t>
       </w:r>
       <w:proofErr w:type="spellStart"/>
+      <w:proofErr w:type="gramStart"/>
       <w:r>
         <w:rPr>
           <w:rFonts w:eastAsia="Times New Roman" w:cs="Courier New"/>
@@ -4357,6 +4414,7 @@
         <w:t>optim.Adam</w:t>
       </w:r>
       <w:proofErr w:type="spellEnd"/>
+      <w:proofErr w:type="gramEnd"/>
       <w:r>
         <w:rPr>
           <w:rFonts w:eastAsia="Times New Roman" w:cs="Times New Roman"/>
@@ -4463,9 +4521,20 @@
           <w:lang w:eastAsia="ja-JP"/>
           <w14:ligatures w14:val="none"/>
         </w:rPr>
-        <w:t>optim.lr_scheduler.ReduceLROnPlateau</w:t>
+        <w:t>optim.lr_</w:t>
+      </w:r>
+      <w:proofErr w:type="gramStart"/>
+      <w:r>
+        <w:rPr>
+          <w:rFonts w:eastAsia="Times New Roman" w:cs="Courier New"/>
+          <w:kern w:val="0"/>
+          <w:lang w:eastAsia="ja-JP"/>
+          <w14:ligatures w14:val="none"/>
+        </w:rPr>
+        <w:t>scheduler.ReduceLROnPlateau</w:t>
       </w:r>
       <w:proofErr w:type="spellEnd"/>
+      <w:proofErr w:type="gramEnd"/>
       <w:r>
         <w:rPr>
           <w:rFonts w:eastAsia="Times New Roman" w:cs="Times New Roman"/>
@@ -4749,38 +4818,38 @@
           <w:bCs/>
           <w:noProof/>
         </w:rPr>
+        <w:t xml:space="preserve">Advanced </w:t>
+      </w:r>
+      <w:r>
+        <w:rPr>
+          <w:b/>
+          <w:bCs/>
+          <w:noProof/>
+        </w:rPr>
+        <w:t xml:space="preserve">Model </w:t>
+      </w:r>
+      <w:r>
+        <w:rPr>
+          <w:b/>
+          <w:bCs/>
+          <w:noProof/>
+        </w:rPr>
+        <w:t>Lyrics Generation</w:t>
+      </w:r>
+    </w:p>
+    <w:p>
+      <w:pPr>
+        <w:rPr>
+          <w:noProof/>
+        </w:rPr>
+      </w:pPr>
+      <w:r>
+        <w:rPr>
+          <w:rFonts w:cstheme="majorBidi"/>
+          <w:b/>
+          <w:bCs/>
+        </w:rPr>
         <w:lastRenderedPageBreak/>
-        <w:t xml:space="preserve">Advanced </w:t>
-      </w:r>
-      <w:r>
-        <w:rPr>
-          <w:b/>
-          <w:bCs/>
-          <w:noProof/>
-        </w:rPr>
-        <w:t xml:space="preserve">Model </w:t>
-      </w:r>
-      <w:r>
-        <w:rPr>
-          <w:b/>
-          <w:bCs/>
-          <w:noProof/>
-        </w:rPr>
-        <w:t>Lyrics Generation</w:t>
-      </w:r>
-    </w:p>
-    <w:p>
-      <w:pPr>
-        <w:rPr>
-          <w:noProof/>
-        </w:rPr>
-      </w:pPr>
-      <w:r>
-        <w:rPr>
-          <w:rFonts w:cstheme="majorBidi"/>
-          <w:b/>
-          <w:bCs/>
-        </w:rPr>
         <w:t xml:space="preserve">Context Preparation: </w:t>
       </w:r>
       <w:r>
@@ -4916,6 +4985,7 @@
         <w:t xml:space="preserve">For the next word to be predicted, its timing (start and end) was estimated by advancing current_time by word_duration (with some added randomness: </w:t>
       </w:r>
       <w:proofErr w:type="spellStart"/>
+      <w:proofErr w:type="gramStart"/>
       <w:r>
         <w:rPr>
           <w:rFonts w:cstheme="majorBidi"/>
@@ -4923,6 +4993,7 @@
         <w:t>random.uniform</w:t>
       </w:r>
       <w:proofErr w:type="spellEnd"/>
+      <w:proofErr w:type="gramEnd"/>
       <w:r>
         <w:rPr>
           <w:rFonts w:cstheme="majorBidi"/>
@@ -5040,162 +5111,180 @@
           <w:rFonts w:cstheme="majorBidi"/>
         </w:rPr>
       </w:pPr>
+      <w:proofErr w:type="gramStart"/>
       <w:r>
         <w:rPr>
           <w:rFonts w:cstheme="majorBidi"/>
           <w:b/>
           <w:bCs/>
         </w:rPr>
-        <w:t>Formatting:</w:t>
-      </w:r>
+        <w:t>Formatting</w:t>
+      </w:r>
+      <w:proofErr w:type="gramEnd"/>
       <w:r>
         <w:rPr>
           <w:rFonts w:cstheme="majorBidi"/>
+          <w:b/>
+          <w:bCs/>
+        </w:rPr>
+        <w:t>:</w:t>
+      </w:r>
+      <w:r>
+        <w:rPr>
+          <w:rFonts w:cstheme="majorBidi"/>
         </w:rPr>
         <w:t xml:space="preserve"> </w:t>
       </w:r>
+      <w:proofErr w:type="gramStart"/>
       <w:r>
         <w:rPr>
           <w:rFonts w:cstheme="majorBidi"/>
         </w:rPr>
-        <w:t>Similar to the simple model, lyrics were formatted to handle special tokens and newlines.</w:t>
-      </w:r>
-    </w:p>
-    <w:p>
-      <w:pPr>
-        <w:rPr>
-          <w:b/>
-          <w:bCs/>
-          <w:noProof/>
-        </w:rPr>
-      </w:pPr>
-    </w:p>
-    <w:p>
-      <w:pPr>
-        <w:rPr>
-          <w:b/>
-          <w:bCs/>
-          <w:noProof/>
-        </w:rPr>
-      </w:pPr>
-    </w:p>
-    <w:p>
-      <w:pPr>
-        <w:rPr>
-          <w:b/>
-          <w:bCs/>
-          <w:noProof/>
-        </w:rPr>
-      </w:pPr>
-    </w:p>
-    <w:p>
-      <w:pPr>
-        <w:rPr>
-          <w:b/>
-          <w:bCs/>
-          <w:noProof/>
-        </w:rPr>
-      </w:pPr>
-    </w:p>
-    <w:p>
-      <w:pPr>
-        <w:rPr>
-          <w:b/>
-          <w:bCs/>
-          <w:noProof/>
-        </w:rPr>
-      </w:pPr>
-    </w:p>
-    <w:p>
-      <w:pPr>
-        <w:rPr>
-          <w:b/>
-          <w:bCs/>
-          <w:noProof/>
-        </w:rPr>
-      </w:pPr>
-    </w:p>
-    <w:p>
-      <w:pPr>
-        <w:rPr>
-          <w:b/>
-          <w:bCs/>
-          <w:noProof/>
-        </w:rPr>
-      </w:pPr>
-    </w:p>
-    <w:p>
-      <w:pPr>
-        <w:rPr>
-          <w:b/>
-          <w:bCs/>
-          <w:noProof/>
-        </w:rPr>
-      </w:pPr>
-    </w:p>
-    <w:p>
-      <w:pPr>
-        <w:rPr>
-          <w:b/>
-          <w:bCs/>
-          <w:noProof/>
-        </w:rPr>
-      </w:pPr>
-    </w:p>
-    <w:p>
-      <w:pPr>
-        <w:rPr>
-          <w:b/>
-          <w:bCs/>
-          <w:noProof/>
-        </w:rPr>
-      </w:pPr>
-    </w:p>
-    <w:p>
-      <w:pPr>
-        <w:rPr>
-          <w:b/>
-          <w:bCs/>
-          <w:noProof/>
-        </w:rPr>
-      </w:pPr>
-    </w:p>
-    <w:p>
-      <w:pPr>
-        <w:rPr>
-          <w:b/>
-          <w:bCs/>
-          <w:noProof/>
-        </w:rPr>
-      </w:pPr>
-      <w:r>
-        <w:rPr>
-          <w:b/>
-          <w:bCs/>
+        <w:t>Similar to</w:t>
+      </w:r>
+      <w:proofErr w:type="gramEnd"/>
+      <w:r>
+        <w:rPr>
+          <w:rFonts w:cstheme="majorBidi"/>
+        </w:rPr>
+        <w:t xml:space="preserve"> the simple model, lyrics were formatted to handle special tokens and newlines.</w:t>
+      </w:r>
+    </w:p>
+    <w:p>
+      <w:pPr>
+        <w:rPr>
+          <w:b/>
+          <w:bCs/>
+          <w:noProof/>
+        </w:rPr>
+      </w:pPr>
+    </w:p>
+    <w:p>
+      <w:pPr>
+        <w:rPr>
+          <w:b/>
+          <w:bCs/>
+          <w:noProof/>
+        </w:rPr>
+      </w:pPr>
+    </w:p>
+    <w:p>
+      <w:pPr>
+        <w:rPr>
+          <w:b/>
+          <w:bCs/>
+          <w:noProof/>
+        </w:rPr>
+      </w:pPr>
+    </w:p>
+    <w:p>
+      <w:pPr>
+        <w:rPr>
+          <w:b/>
+          <w:bCs/>
+          <w:noProof/>
+        </w:rPr>
+      </w:pPr>
+    </w:p>
+    <w:p>
+      <w:pPr>
+        <w:rPr>
+          <w:b/>
+          <w:bCs/>
+          <w:noProof/>
+        </w:rPr>
+      </w:pPr>
+    </w:p>
+    <w:p>
+      <w:pPr>
+        <w:rPr>
+          <w:b/>
+          <w:bCs/>
+          <w:noProof/>
+        </w:rPr>
+      </w:pPr>
+    </w:p>
+    <w:p>
+      <w:pPr>
+        <w:rPr>
+          <w:b/>
+          <w:bCs/>
+          <w:noProof/>
+        </w:rPr>
+      </w:pPr>
+    </w:p>
+    <w:p>
+      <w:pPr>
+        <w:rPr>
+          <w:b/>
+          <w:bCs/>
+          <w:noProof/>
+        </w:rPr>
+      </w:pPr>
+    </w:p>
+    <w:p>
+      <w:pPr>
+        <w:rPr>
+          <w:b/>
+          <w:bCs/>
+          <w:noProof/>
+        </w:rPr>
+      </w:pPr>
+    </w:p>
+    <w:p>
+      <w:pPr>
+        <w:rPr>
+          <w:b/>
+          <w:bCs/>
+          <w:noProof/>
+        </w:rPr>
+      </w:pPr>
+    </w:p>
+    <w:p>
+      <w:pPr>
+        <w:rPr>
+          <w:b/>
+          <w:bCs/>
+          <w:noProof/>
+        </w:rPr>
+      </w:pPr>
+    </w:p>
+    <w:p>
+      <w:pPr>
+        <w:rPr>
+          <w:b/>
+          <w:bCs/>
+          <w:noProof/>
+        </w:rPr>
+      </w:pPr>
+      <w:r>
+        <w:rPr>
+          <w:b/>
+          <w:bCs/>
+          <w:noProof/>
+        </w:rPr>
+        <w:t>Examples of generated lyrics</w:t>
+      </w:r>
+      <w:r>
+        <w:rPr>
+          <w:b/>
+          <w:bCs/>
+          <w:noProof/>
+        </w:rPr>
+        <w:t>:</w:t>
+      </w:r>
+    </w:p>
+    <w:p>
+      <w:pPr>
+        <w:rPr>
+          <w:noProof/>
+        </w:rPr>
+      </w:pPr>
+      <w:r>
+        <w:rPr>
           <w:noProof/>
         </w:rPr>
         <w:lastRenderedPageBreak/>
-        <w:t>Examples of generated lyrics</w:t>
-      </w:r>
-      <w:r>
-        <w:rPr>
-          <w:b/>
-          <w:bCs/>
-          <w:noProof/>
-        </w:rPr>
-        <w:t>:</w:t>
-      </w:r>
-    </w:p>
-    <w:p>
-      <w:pPr>
-        <w:rPr>
-          <w:noProof/>
-        </w:rPr>
-      </w:pPr>
-      <w:r>
-        <w:rPr>
-          <w:noProof/>
-        </w:rPr>
         <w:t>Song: the_bangles - eternal_flame. Starting word: '&lt;START&gt;'</w:t>
       </w:r>
     </w:p>
@@ -5672,29 +5761,30 @@
           <w:bCs/>
           <w:u w:val="single"/>
         </w:rPr>
+        <w:t xml:space="preserve">4. </w:t>
+      </w:r>
+      <w:r>
+        <w:rPr>
+          <w:rFonts w:cstheme="majorBidi"/>
+          <w:b/>
+          <w:bCs/>
+          <w:u w:val="single"/>
+        </w:rPr>
+        <w:t>Results and Comparative Analysis</w:t>
+      </w:r>
+    </w:p>
+    <w:p>
+      <w:pPr>
+        <w:rPr>
+          <w:rFonts w:cstheme="majorBidi"/>
+        </w:rPr>
+      </w:pPr>
+      <w:r>
+        <w:rPr>
+          <w:rFonts w:cstheme="majorBidi"/>
+          <w:noProof/>
+        </w:rPr>
         <w:lastRenderedPageBreak/>
-        <w:t xml:space="preserve">4. </w:t>
-      </w:r>
-      <w:r>
-        <w:rPr>
-          <w:rFonts w:cstheme="majorBidi"/>
-          <w:b/>
-          <w:bCs/>
-          <w:u w:val="single"/>
-        </w:rPr>
-        <w:t>Results and Comparative Analysis</w:t>
-      </w:r>
-    </w:p>
-    <w:p>
-      <w:pPr>
-        <w:rPr>
-          <w:rFonts w:cstheme="majorBidi"/>
-        </w:rPr>
-      </w:pPr>
-      <w:r>
-        <w:rPr>
-          <w:rFonts w:cstheme="majorBidi"/>
-        </w:rPr>
         <w:drawing>
           <wp:anchor distT="0" distB="0" distL="114300" distR="114300" simplePos="0" relativeHeight="251658240" behindDoc="0" locked="0" layoutInCell="1" allowOverlap="1" wp14:anchorId="0A203593" wp14:editId="43CEFF2C">
             <wp:simplePos x="0" y="0"/>
@@ -5930,7 +6020,27 @@
           <w:szCs w:val="22"/>
           <w:lang w:val="en-US"/>
         </w:rPr>
-        <w:t>,' which uses common words that were likely in our training data, generally received higher BLEU scores. In contrast, a song like 'Aqua - Barbie Girl,' which has unique or informal words (like 'hiya') that might not have been common in the training data, got lower BLEU scores. This shows that the models perform better when the song's vocabulary is similar to what they learned during training.</w:t>
+        <w:t xml:space="preserve">,' which uses common words that were likely in our training data, generally received higher BLEU scores. In contrast, a song like 'Aqua - Barbie Girl,' which has unique or informal words (like 'hiya') that might not have been common in the training data, got lower BLEU scores. This shows that the models perform better when the song's vocabulary is </w:t>
+      </w:r>
+      <w:proofErr w:type="gramStart"/>
+      <w:r>
+        <w:rPr>
+          <w:rFonts w:asciiTheme="minorHAnsi" w:hAnsiTheme="minorHAnsi" w:cstheme="majorBidi"/>
+          <w:sz w:val="22"/>
+          <w:szCs w:val="22"/>
+          <w:lang w:val="en-US"/>
+        </w:rPr>
+        <w:t>similar to</w:t>
+      </w:r>
+      <w:proofErr w:type="gramEnd"/>
+      <w:r>
+        <w:rPr>
+          <w:rFonts w:asciiTheme="minorHAnsi" w:hAnsiTheme="minorHAnsi" w:cstheme="majorBidi"/>
+          <w:sz w:val="22"/>
+          <w:szCs w:val="22"/>
+          <w:lang w:val="en-US"/>
+        </w:rPr>
+        <w:t xml:space="preserve"> what they learned during training.</w:t>
       </w:r>
     </w:p>
     <w:p>
@@ -5965,7 +6075,27 @@
           <w:szCs w:val="22"/>
           <w:lang w:val="en-US"/>
         </w:rPr>
-        <w:t xml:space="preserve"> There was a clear difference in how long the lyrics were. The Simple Model tended to write short lyrics, averaging about 52 words per song. The Advanced Model, however, wrote much longer lyrics, averaging around 120 words. Since the Advanced Model's longer lyrics also generally made more sense, this suggests it's better at continuing a lyrical idea and developing themes within a song.</w:t>
+        <w:t xml:space="preserve"> There was a clear difference in how long the lyrics were. The Simple Model tended to write short lyrics, averaging about 52 words per song. The Advanced Model, however, wrote much longer lyrics, averaging around 120 words. Since the Advanced Model's longer lyrics also generally </w:t>
+      </w:r>
+      <w:proofErr w:type="gramStart"/>
+      <w:r>
+        <w:rPr>
+          <w:rFonts w:asciiTheme="minorHAnsi" w:hAnsiTheme="minorHAnsi" w:cstheme="majorBidi"/>
+          <w:sz w:val="22"/>
+          <w:szCs w:val="22"/>
+          <w:lang w:val="en-US"/>
+        </w:rPr>
+        <w:t>made</w:t>
+      </w:r>
+      <w:proofErr w:type="gramEnd"/>
+      <w:r>
+        <w:rPr>
+          <w:rFonts w:asciiTheme="minorHAnsi" w:hAnsiTheme="minorHAnsi" w:cstheme="majorBidi"/>
+          <w:sz w:val="22"/>
+          <w:szCs w:val="22"/>
+          <w:lang w:val="en-US"/>
+        </w:rPr>
+        <w:t xml:space="preserve"> more sense, this suggests it's better at continuing a lyrical idea and developing themes within a song.</w:t>
       </w:r>
     </w:p>
     <w:p>

</xml_diff>